<commit_message>
Delimitar el tema del debido cuidado y agregar propuesta de protocolo
Co-Authored-By: Claude Opus 5.5 <noreply@anthropic.com>
Claude-Session: https://claude.ai/code/session_01MPxHATC7J23odgNHR4pRGu
</commit_message>
<xml_diff>
--- a/Portada_Debido_Cuidado.docx
+++ b/Portada_Debido_Cuidado.docx
@@ -326,7 +326,7 @@
           <w:rFonts w:cs="Arial"/>
           <w:lang w:val="es-SV"/>
         </w:rPr>
-        <w:t>“La teoría del debido cuidado”</w:t>
+        <w:t>“Análisis de la aplicación de la teoría del debido cuidado en los supermercados del municipio de San Salvador, durante el segundo semestre de 2026, y propuesta de un protocolo de debido cuidado hacia el consumidor”</w:t>
       </w:r>
     </w:p>
     <w:p>
@@ -1405,6 +1405,1270 @@
           <w:lang w:val="es-ES"/>
         </w:rPr>
         <w:t xml:space="preserve"> de 2026</w:t>
+      </w:r>
+    </w:p>
+    <w:p>
+      <w:pPr>
+        <w:spacing w:before="0" w:after="240" w:line="360" w:lineRule="auto"/>
+        <w:jc w:val="center"/>
+        <w:rPr>
+          <w:rFonts w:cs="Arial"/>
+          <w:b/>
+          <w:szCs w:val="24"/>
+          <w:lang w:val="es-SV"/>
+        </w:rPr>
+      </w:pPr>
+      <w:r>
+        <w:rPr>
+          <w:rFonts w:cs="Arial"/>
+          <w:b/>
+          <w:szCs w:val="24"/>
+          <w:lang w:val="es-SV"/>
+        </w:rPr>
+        <w:br w:type="page"/>
+      </w:r>
+      <w:r>
+        <w:rPr>
+          <w:rFonts w:cs="Arial"/>
+          <w:b/>
+          <w:szCs w:val="24"/>
+          <w:lang w:val="es-SV"/>
+        </w:rPr>
+        <w:t xml:space="preserve">DELIMITACIÓN DEL TEMA</w:t>
+      </w:r>
+    </w:p>
+    <w:p>
+      <w:pPr>
+        <w:spacing w:before="240" w:after="160" w:line="360" w:lineRule="auto"/>
+        <w:jc w:val="both"/>
+        <w:rPr>
+          <w:rFonts w:cs="Arial"/>
+          <w:b/>
+          <w:szCs w:val="24"/>
+          <w:lang w:val="es-SV"/>
+        </w:rPr>
+      </w:pPr>
+      <w:r>
+        <w:rPr>
+          <w:rFonts w:cs="Arial"/>
+          <w:b/>
+          <w:szCs w:val="24"/>
+          <w:lang w:val="es-SV"/>
+        </w:rPr>
+        <w:t xml:space="preserve">Tema de investigación</w:t>
+      </w:r>
+    </w:p>
+    <w:p>
+      <w:pPr>
+        <w:spacing w:before="0" w:after="160" w:line="360" w:lineRule="auto"/>
+        <w:jc w:val="both"/>
+        <w:rPr>
+          <w:rFonts w:cs="Arial"/>
+          <w:szCs w:val="24"/>
+          <w:lang w:val="es-SV"/>
+        </w:rPr>
+      </w:pPr>
+      <w:r>
+        <w:rPr>
+          <w:rFonts w:cs="Arial"/>
+          <w:szCs w:val="24"/>
+          <w:lang w:val="es-SV"/>
+        </w:rPr>
+        <w:t xml:space="preserve">“Análisis de la aplicación de la teoría del debido cuidado en los supermercados del municipio de San Salvador, durante el segundo semestre de 2026, y propuesta de un protocolo de debido cuidado hacia el consumidor”.</w:t>
+      </w:r>
+    </w:p>
+    <w:p>
+      <w:pPr>
+        <w:spacing w:before="240" w:after="160" w:line="360" w:lineRule="auto"/>
+        <w:jc w:val="both"/>
+        <w:rPr>
+          <w:rFonts w:cs="Arial"/>
+          <w:b/>
+          <w:szCs w:val="24"/>
+          <w:lang w:val="es-SV"/>
+        </w:rPr>
+      </w:pPr>
+      <w:r>
+        <w:rPr>
+          <w:rFonts w:cs="Arial"/>
+          <w:b/>
+          <w:szCs w:val="24"/>
+          <w:lang w:val="es-SV"/>
+        </w:rPr>
+        <w:t xml:space="preserve">Delimitación teórica</w:t>
+      </w:r>
+    </w:p>
+    <w:p>
+      <w:pPr>
+        <w:spacing w:before="0" w:after="160" w:line="360" w:lineRule="auto"/>
+        <w:jc w:val="both"/>
+        <w:rPr>
+          <w:rFonts w:cs="Arial"/>
+          <w:szCs w:val="24"/>
+          <w:lang w:val="es-SV"/>
+        </w:rPr>
+      </w:pPr>
+      <w:r>
+        <w:rPr>
+          <w:rFonts w:cs="Arial"/>
+          <w:szCs w:val="24"/>
+          <w:lang w:val="es-SV"/>
+        </w:rPr>
+        <w:t xml:space="preserve">La investigación se fundamenta en la teoría del debido cuidado, que forma parte de la ética de la producción para el consumidor y el marketing. Esta teoría sostiene que, debido a que el fabricante y el vendedor conocen mejor el producto que el consumidor, tienen la obligación de tomar todas las precauciones razonables para que sus productos no causen daño. El estudio se centra en las obligaciones de debido cuidado en el diseño, la producción, la información y advertencias, y el seguimiento posterior a la venta, así como en los problemas que presenta esta teoría.</w:t>
+      </w:r>
+    </w:p>
+    <w:p>
+      <w:pPr>
+        <w:spacing w:before="240" w:after="160" w:line="360" w:lineRule="auto"/>
+        <w:jc w:val="both"/>
+        <w:rPr>
+          <w:rFonts w:cs="Arial"/>
+          <w:b/>
+          <w:szCs w:val="24"/>
+          <w:lang w:val="es-SV"/>
+        </w:rPr>
+      </w:pPr>
+      <w:r>
+        <w:rPr>
+          <w:rFonts w:cs="Arial"/>
+          <w:b/>
+          <w:szCs w:val="24"/>
+          <w:lang w:val="es-SV"/>
+        </w:rPr>
+        <w:t xml:space="preserve">Delimitación espacial</w:t>
+      </w:r>
+    </w:p>
+    <w:p>
+      <w:pPr>
+        <w:spacing w:before="0" w:after="160" w:line="360" w:lineRule="auto"/>
+        <w:jc w:val="both"/>
+        <w:rPr>
+          <w:rFonts w:cs="Arial"/>
+          <w:szCs w:val="24"/>
+          <w:lang w:val="es-SV"/>
+        </w:rPr>
+      </w:pPr>
+      <w:r>
+        <w:rPr>
+          <w:rFonts w:cs="Arial"/>
+          <w:szCs w:val="24"/>
+          <w:lang w:val="es-SV"/>
+        </w:rPr>
+        <w:t xml:space="preserve">La investigación se realizará en los supermercados ubicados en el municipio de San Salvador, departamento de San Salvador, El Salvador.</w:t>
+      </w:r>
+    </w:p>
+    <w:p>
+      <w:pPr>
+        <w:spacing w:before="240" w:after="160" w:line="360" w:lineRule="auto"/>
+        <w:jc w:val="both"/>
+        <w:rPr>
+          <w:rFonts w:cs="Arial"/>
+          <w:b/>
+          <w:szCs w:val="24"/>
+          <w:lang w:val="es-SV"/>
+        </w:rPr>
+      </w:pPr>
+      <w:r>
+        <w:rPr>
+          <w:rFonts w:cs="Arial"/>
+          <w:b/>
+          <w:szCs w:val="24"/>
+          <w:lang w:val="es-SV"/>
+        </w:rPr>
+        <w:t xml:space="preserve">Delimitación temporal</w:t>
+      </w:r>
+    </w:p>
+    <w:p>
+      <w:pPr>
+        <w:spacing w:before="0" w:after="160" w:line="360" w:lineRule="auto"/>
+        <w:jc w:val="both"/>
+        <w:rPr>
+          <w:rFonts w:cs="Arial"/>
+          <w:szCs w:val="24"/>
+          <w:lang w:val="es-SV"/>
+        </w:rPr>
+      </w:pPr>
+      <w:r>
+        <w:rPr>
+          <w:rFonts w:cs="Arial"/>
+          <w:szCs w:val="24"/>
+          <w:lang w:val="es-SV"/>
+        </w:rPr>
+        <w:t xml:space="preserve">El estudio comprende el segundo semestre del año 2026, específicamente de agosto a noviembre de 2026.</w:t>
+      </w:r>
+    </w:p>
+    <w:p>
+      <w:pPr>
+        <w:spacing w:before="240" w:after="160" w:line="360" w:lineRule="auto"/>
+        <w:jc w:val="both"/>
+        <w:rPr>
+          <w:rFonts w:cs="Arial"/>
+          <w:b/>
+          <w:szCs w:val="24"/>
+          <w:lang w:val="es-SV"/>
+        </w:rPr>
+      </w:pPr>
+      <w:r>
+        <w:rPr>
+          <w:rFonts w:cs="Arial"/>
+          <w:b/>
+          <w:szCs w:val="24"/>
+          <w:lang w:val="es-SV"/>
+        </w:rPr>
+        <w:t xml:space="preserve">Delimitación de sujetos</w:t>
+      </w:r>
+    </w:p>
+    <w:p>
+      <w:pPr>
+        <w:spacing w:before="0" w:after="60" w:line="360" w:lineRule="auto"/>
+        <w:ind w:left="567"/>
+        <w:jc w:val="both"/>
+        <w:rPr>
+          <w:rFonts w:cs="Arial"/>
+          <w:szCs w:val="24"/>
+          <w:lang w:val="es-SV"/>
+        </w:rPr>
+      </w:pPr>
+      <w:r>
+        <w:rPr>
+          <w:rFonts w:cs="Arial"/>
+          <w:szCs w:val="24"/>
+          <w:lang w:val="es-SV"/>
+        </w:rPr>
+        <w:t xml:space="preserve">•  Consumidores que realizan sus compras en supermercados del municipio de San Salvador.</w:t>
+      </w:r>
+    </w:p>
+    <w:p>
+      <w:pPr>
+        <w:spacing w:before="0" w:after="60" w:line="360" w:lineRule="auto"/>
+        <w:ind w:left="567"/>
+        <w:jc w:val="both"/>
+        <w:rPr>
+          <w:rFonts w:cs="Arial"/>
+          <w:szCs w:val="24"/>
+          <w:lang w:val="es-SV"/>
+        </w:rPr>
+      </w:pPr>
+      <w:r>
+        <w:rPr>
+          <w:rFonts w:cs="Arial"/>
+          <w:szCs w:val="24"/>
+          <w:lang w:val="es-SV"/>
+        </w:rPr>
+        <w:t xml:space="preserve">•  Personal de atención al cliente y encargados de sala de venta de los supermercados.</w:t>
+      </w:r>
+    </w:p>
+    <w:p>
+      <w:pPr>
+        <w:spacing w:before="240" w:after="160" w:line="360" w:lineRule="auto"/>
+        <w:jc w:val="both"/>
+        <w:rPr>
+          <w:rFonts w:cs="Arial"/>
+          <w:b/>
+          <w:szCs w:val="24"/>
+          <w:lang w:val="es-SV"/>
+        </w:rPr>
+      </w:pPr>
+      <w:r>
+        <w:rPr>
+          <w:rFonts w:cs="Arial"/>
+          <w:b/>
+          <w:szCs w:val="24"/>
+          <w:lang w:val="es-SV"/>
+        </w:rPr>
+        <w:t xml:space="preserve">Delimitación del objeto de estudio</w:t>
+      </w:r>
+    </w:p>
+    <w:p>
+      <w:pPr>
+        <w:spacing w:before="0" w:after="160" w:line="360" w:lineRule="auto"/>
+        <w:jc w:val="both"/>
+        <w:rPr>
+          <w:rFonts w:cs="Arial"/>
+          <w:szCs w:val="24"/>
+          <w:lang w:val="es-SV"/>
+        </w:rPr>
+      </w:pPr>
+      <w:r>
+        <w:rPr>
+          <w:rFonts w:cs="Arial"/>
+          <w:szCs w:val="24"/>
+          <w:lang w:val="es-SV"/>
+        </w:rPr>
+        <w:t xml:space="preserve">Se analizarán los productos alimenticios, de limpieza y de cuidado personal que se venden en los supermercados, por ser los que tienen mayor relación con la salud y la seguridad del consumidor. Se evaluarán aspectos como el etiquetado, las advertencias, las fechas de vencimiento, el estado de conservación de los productos y la atención de reclamos.</w:t>
+      </w:r>
+    </w:p>
+    <w:p>
+      <w:pPr>
+        <w:spacing w:before="240" w:after="160" w:line="360" w:lineRule="auto"/>
+        <w:jc w:val="both"/>
+        <w:rPr>
+          <w:rFonts w:cs="Arial"/>
+          <w:b/>
+          <w:szCs w:val="24"/>
+          <w:lang w:val="es-SV"/>
+        </w:rPr>
+      </w:pPr>
+      <w:r>
+        <w:rPr>
+          <w:rFonts w:cs="Arial"/>
+          <w:b/>
+          <w:szCs w:val="24"/>
+          <w:lang w:val="es-SV"/>
+        </w:rPr>
+        <w:t xml:space="preserve">Objetivo general</w:t>
+      </w:r>
+    </w:p>
+    <w:p>
+      <w:pPr>
+        <w:spacing w:before="0" w:after="160" w:line="360" w:lineRule="auto"/>
+        <w:jc w:val="both"/>
+        <w:rPr>
+          <w:rFonts w:cs="Arial"/>
+          <w:szCs w:val="24"/>
+          <w:lang w:val="es-SV"/>
+        </w:rPr>
+      </w:pPr>
+      <w:r>
+        <w:rPr>
+          <w:rFonts w:cs="Arial"/>
+          <w:szCs w:val="24"/>
+          <w:lang w:val="es-SV"/>
+        </w:rPr>
+        <w:t xml:space="preserve">Analizar la aplicación de la teoría del debido cuidado en los supermercados del municipio de San Salvador durante el segundo semestre de 2026, con el fin de proponer un protocolo de debido cuidado que fortalezca la protección del consumidor.</w:t>
+      </w:r>
+    </w:p>
+    <w:p>
+      <w:pPr>
+        <w:spacing w:before="240" w:after="160" w:line="360" w:lineRule="auto"/>
+        <w:jc w:val="both"/>
+        <w:rPr>
+          <w:rFonts w:cs="Arial"/>
+          <w:b/>
+          <w:szCs w:val="24"/>
+          <w:lang w:val="es-SV"/>
+        </w:rPr>
+      </w:pPr>
+      <w:r>
+        <w:rPr>
+          <w:rFonts w:cs="Arial"/>
+          <w:b/>
+          <w:szCs w:val="24"/>
+          <w:lang w:val="es-SV"/>
+        </w:rPr>
+        <w:t xml:space="preserve">Objetivos específicos</w:t>
+      </w:r>
+    </w:p>
+    <w:p>
+      <w:pPr>
+        <w:spacing w:before="0" w:after="60" w:line="360" w:lineRule="auto"/>
+        <w:ind w:left="567"/>
+        <w:jc w:val="both"/>
+        <w:rPr>
+          <w:rFonts w:cs="Arial"/>
+          <w:szCs w:val="24"/>
+          <w:lang w:val="es-SV"/>
+        </w:rPr>
+      </w:pPr>
+      <w:r>
+        <w:rPr>
+          <w:rFonts w:cs="Arial"/>
+          <w:szCs w:val="24"/>
+          <w:lang w:val="es-SV"/>
+        </w:rPr>
+        <w:t xml:space="preserve">•  Describir los fundamentos de la teoría del debido cuidado y sus implicaciones éticas para las empresas.</w:t>
+      </w:r>
+    </w:p>
+    <w:p>
+      <w:pPr>
+        <w:spacing w:before="0" w:after="60" w:line="360" w:lineRule="auto"/>
+        <w:ind w:left="567"/>
+        <w:jc w:val="both"/>
+        <w:rPr>
+          <w:rFonts w:cs="Arial"/>
+          <w:szCs w:val="24"/>
+          <w:lang w:val="es-SV"/>
+        </w:rPr>
+      </w:pPr>
+      <w:r>
+        <w:rPr>
+          <w:rFonts w:cs="Arial"/>
+          <w:szCs w:val="24"/>
+          <w:lang w:val="es-SV"/>
+        </w:rPr>
+        <w:t xml:space="preserve">•  Identificar las prácticas de cuidado que aplican los supermercados en cuanto a la calidad, el etiquetado y la seguridad de los productos.</w:t>
+      </w:r>
+    </w:p>
+    <w:p>
+      <w:pPr>
+        <w:spacing w:before="0" w:after="60" w:line="360" w:lineRule="auto"/>
+        <w:ind w:left="567"/>
+        <w:jc w:val="both"/>
+        <w:rPr>
+          <w:rFonts w:cs="Arial"/>
+          <w:szCs w:val="24"/>
+          <w:lang w:val="es-SV"/>
+        </w:rPr>
+      </w:pPr>
+      <w:r>
+        <w:rPr>
+          <w:rFonts w:cs="Arial"/>
+          <w:szCs w:val="24"/>
+          <w:lang w:val="es-SV"/>
+        </w:rPr>
+        <w:t xml:space="preserve">•  Conocer la percepción de los consumidores sobre el cuidado que reciben de los supermercados.</w:t>
+      </w:r>
+    </w:p>
+    <w:p>
+      <w:pPr>
+        <w:spacing w:before="0" w:after="60" w:line="360" w:lineRule="auto"/>
+        <w:ind w:left="567"/>
+        <w:jc w:val="both"/>
+        <w:rPr>
+          <w:rFonts w:cs="Arial"/>
+          <w:szCs w:val="24"/>
+          <w:lang w:val="es-SV"/>
+        </w:rPr>
+      </w:pPr>
+      <w:r>
+        <w:rPr>
+          <w:rFonts w:cs="Arial"/>
+          <w:szCs w:val="24"/>
+          <w:lang w:val="es-SV"/>
+        </w:rPr>
+        <w:t xml:space="preserve">•  Diseñar un protocolo de debido cuidado aplicable a los supermercados del municipio de San Salvador.</w:t>
+      </w:r>
+    </w:p>
+    <w:p>
+      <w:pPr>
+        <w:spacing w:before="0" w:after="240" w:line="360" w:lineRule="auto"/>
+        <w:jc w:val="center"/>
+        <w:rPr>
+          <w:rFonts w:cs="Arial"/>
+          <w:b/>
+          <w:szCs w:val="24"/>
+          <w:lang w:val="es-SV"/>
+        </w:rPr>
+      </w:pPr>
+      <w:r>
+        <w:rPr>
+          <w:rFonts w:cs="Arial"/>
+          <w:b/>
+          <w:szCs w:val="24"/>
+          <w:lang w:val="es-SV"/>
+        </w:rPr>
+        <w:br w:type="page"/>
+      </w:r>
+      <w:r>
+        <w:rPr>
+          <w:rFonts w:cs="Arial"/>
+          <w:b/>
+          <w:szCs w:val="24"/>
+          <w:lang w:val="es-SV"/>
+        </w:rPr>
+        <w:t xml:space="preserve">PROPUESTA: PROTOCOLO DE DEBIDO CUIDADO DE LA EMPRESA HACIA EL CONSUMIDOR</w:t>
+      </w:r>
+    </w:p>
+    <w:p>
+      <w:pPr>
+        <w:spacing w:before="240" w:after="160" w:line="360" w:lineRule="auto"/>
+        <w:jc w:val="both"/>
+        <w:rPr>
+          <w:rFonts w:cs="Arial"/>
+          <w:b/>
+          <w:szCs w:val="24"/>
+          <w:lang w:val="es-SV"/>
+        </w:rPr>
+      </w:pPr>
+      <w:r>
+        <w:rPr>
+          <w:rFonts w:cs="Arial"/>
+          <w:b/>
+          <w:szCs w:val="24"/>
+          <w:lang w:val="es-SV"/>
+        </w:rPr>
+        <w:t xml:space="preserve">Presentación</w:t>
+      </w:r>
+    </w:p>
+    <w:p>
+      <w:pPr>
+        <w:spacing w:before="0" w:after="160" w:line="360" w:lineRule="auto"/>
+        <w:jc w:val="both"/>
+        <w:rPr>
+          <w:rFonts w:cs="Arial"/>
+          <w:szCs w:val="24"/>
+          <w:lang w:val="es-SV"/>
+        </w:rPr>
+      </w:pPr>
+      <w:r>
+        <w:rPr>
+          <w:rFonts w:cs="Arial"/>
+          <w:szCs w:val="24"/>
+          <w:lang w:val="es-SV"/>
+        </w:rPr>
+        <w:t xml:space="preserve">La teoría del debido cuidado reconoce que la empresa y el consumidor no están en igualdad de condiciones: la empresa conoce los materiales, procesos y riesgos de sus productos, mientras que el consumidor depende de la información que recibe y de la confianza que deposita en ella. Por esta razón, la empresa tiene el deber ético de prevenir daños aunque el contrato de compraventa no lo exija expresamente. El presente protocolo propone acciones concretas para que los supermercados del municipio de San Salvador apliquen este deber en su operación diaria.</w:t>
+      </w:r>
+    </w:p>
+    <w:p>
+      <w:pPr>
+        <w:spacing w:before="240" w:after="160" w:line="360" w:lineRule="auto"/>
+        <w:jc w:val="both"/>
+        <w:rPr>
+          <w:rFonts w:cs="Arial"/>
+          <w:b/>
+          <w:szCs w:val="24"/>
+          <w:lang w:val="es-SV"/>
+        </w:rPr>
+      </w:pPr>
+      <w:r>
+        <w:rPr>
+          <w:rFonts w:cs="Arial"/>
+          <w:b/>
+          <w:szCs w:val="24"/>
+          <w:lang w:val="es-SV"/>
+        </w:rPr>
+        <w:t xml:space="preserve">Objetivo</w:t>
+      </w:r>
+    </w:p>
+    <w:p>
+      <w:pPr>
+        <w:spacing w:before="0" w:after="160" w:line="360" w:lineRule="auto"/>
+        <w:jc w:val="both"/>
+        <w:rPr>
+          <w:rFonts w:cs="Arial"/>
+          <w:szCs w:val="24"/>
+          <w:lang w:val="es-SV"/>
+        </w:rPr>
+      </w:pPr>
+      <w:r>
+        <w:rPr>
+          <w:rFonts w:cs="Arial"/>
+          <w:szCs w:val="24"/>
+          <w:lang w:val="es-SV"/>
+        </w:rPr>
+        <w:t xml:space="preserve">Establecer lineamientos que garanticen que los productos ofrecidos por los supermercados sean seguros, estén en buen estado y cuenten con la información necesaria para su uso correcto, protegiendo la salud y los intereses del consumidor.</w:t>
+      </w:r>
+    </w:p>
+    <w:p>
+      <w:pPr>
+        <w:spacing w:before="240" w:after="160" w:line="360" w:lineRule="auto"/>
+        <w:jc w:val="both"/>
+        <w:rPr>
+          <w:rFonts w:cs="Arial"/>
+          <w:b/>
+          <w:szCs w:val="24"/>
+          <w:lang w:val="es-SV"/>
+        </w:rPr>
+      </w:pPr>
+      <w:r>
+        <w:rPr>
+          <w:rFonts w:cs="Arial"/>
+          <w:b/>
+          <w:szCs w:val="24"/>
+          <w:lang w:val="es-SV"/>
+        </w:rPr>
+        <w:t xml:space="preserve">Alcance</w:t>
+      </w:r>
+    </w:p>
+    <w:p>
+      <w:pPr>
+        <w:spacing w:before="0" w:after="160" w:line="360" w:lineRule="auto"/>
+        <w:jc w:val="both"/>
+        <w:rPr>
+          <w:rFonts w:cs="Arial"/>
+          <w:szCs w:val="24"/>
+          <w:lang w:val="es-SV"/>
+        </w:rPr>
+      </w:pPr>
+      <w:r>
+        <w:rPr>
+          <w:rFonts w:cs="Arial"/>
+          <w:szCs w:val="24"/>
+          <w:lang w:val="es-SV"/>
+        </w:rPr>
+        <w:t xml:space="preserve">Este protocolo aplica a directivos, encargados de compras, bodega, sala de venta, atención al cliente y marketing de los supermercados, así como a los proveedores que abastecen sus productos.</w:t>
+      </w:r>
+    </w:p>
+    <w:p>
+      <w:pPr>
+        <w:spacing w:before="240" w:after="160" w:line="360" w:lineRule="auto"/>
+        <w:jc w:val="both"/>
+        <w:rPr>
+          <w:rFonts w:cs="Arial"/>
+          <w:b/>
+          <w:szCs w:val="24"/>
+          <w:lang w:val="es-SV"/>
+        </w:rPr>
+      </w:pPr>
+      <w:r>
+        <w:rPr>
+          <w:rFonts w:cs="Arial"/>
+          <w:b/>
+          <w:szCs w:val="24"/>
+          <w:lang w:val="es-SV"/>
+        </w:rPr>
+        <w:t xml:space="preserve">Etapa 1. Selección de proveedores y productos</w:t>
+      </w:r>
+    </w:p>
+    <w:p>
+      <w:pPr>
+        <w:spacing w:before="0" w:after="160" w:line="360" w:lineRule="auto"/>
+        <w:jc w:val="both"/>
+        <w:rPr>
+          <w:rFonts w:cs="Arial"/>
+          <w:szCs w:val="24"/>
+          <w:lang w:val="es-SV"/>
+        </w:rPr>
+      </w:pPr>
+      <w:r>
+        <w:rPr>
+          <w:rFonts w:cs="Arial"/>
+          <w:b/>
+          <w:szCs w:val="24"/>
+          <w:lang w:val="es-SV"/>
+        </w:rPr>
+        <w:t xml:space="preserve">Acción 1. </w:t>
+      </w:r>
+      <w:r>
+        <w:rPr>
+          <w:rFonts w:cs="Arial"/>
+          <w:szCs w:val="24"/>
+          <w:lang w:val="es-SV"/>
+        </w:rPr>
+        <w:t xml:space="preserve">Comprar únicamente a proveedores que cuenten con registro sanitario y que cumplan las normas de calidad vigentes en El Salvador.</w:t>
+      </w:r>
+    </w:p>
+    <w:p>
+      <w:pPr>
+        <w:spacing w:before="0" w:after="160" w:line="360" w:lineRule="auto"/>
+        <w:jc w:val="both"/>
+        <w:rPr>
+          <w:rFonts w:cs="Arial"/>
+          <w:szCs w:val="24"/>
+          <w:lang w:val="es-SV"/>
+        </w:rPr>
+      </w:pPr>
+      <w:r>
+        <w:rPr>
+          <w:rFonts w:cs="Arial"/>
+          <w:b/>
+          <w:szCs w:val="24"/>
+          <w:lang w:val="es-SV"/>
+        </w:rPr>
+        <w:t xml:space="preserve">Acción 2. </w:t>
+      </w:r>
+      <w:r>
+        <w:rPr>
+          <w:rFonts w:cs="Arial"/>
+          <w:szCs w:val="24"/>
+          <w:lang w:val="es-SV"/>
+        </w:rPr>
+        <w:t xml:space="preserve">Revisar que cada producto nuevo tenga etiquetado completo en español, con ingredientes, fecha de vencimiento, advertencias y datos del fabricante.</w:t>
+      </w:r>
+    </w:p>
+    <w:p>
+      <w:pPr>
+        <w:spacing w:before="240" w:after="160" w:line="360" w:lineRule="auto"/>
+        <w:jc w:val="both"/>
+        <w:rPr>
+          <w:rFonts w:cs="Arial"/>
+          <w:b/>
+          <w:szCs w:val="24"/>
+          <w:lang w:val="es-SV"/>
+        </w:rPr>
+      </w:pPr>
+      <w:r>
+        <w:rPr>
+          <w:rFonts w:cs="Arial"/>
+          <w:b/>
+          <w:szCs w:val="24"/>
+          <w:lang w:val="es-SV"/>
+        </w:rPr>
+        <w:t xml:space="preserve">Etapa 2. Almacenamiento y conservación</w:t>
+      </w:r>
+    </w:p>
+    <w:p>
+      <w:pPr>
+        <w:spacing w:before="0" w:after="160" w:line="360" w:lineRule="auto"/>
+        <w:jc w:val="both"/>
+        <w:rPr>
+          <w:rFonts w:cs="Arial"/>
+          <w:szCs w:val="24"/>
+          <w:lang w:val="es-SV"/>
+        </w:rPr>
+      </w:pPr>
+      <w:r>
+        <w:rPr>
+          <w:rFonts w:cs="Arial"/>
+          <w:b/>
+          <w:szCs w:val="24"/>
+          <w:lang w:val="es-SV"/>
+        </w:rPr>
+        <w:t xml:space="preserve">Acción 3. </w:t>
+      </w:r>
+      <w:r>
+        <w:rPr>
+          <w:rFonts w:cs="Arial"/>
+          <w:szCs w:val="24"/>
+          <w:lang w:val="es-SV"/>
+        </w:rPr>
+        <w:t xml:space="preserve">Mantener la cadena de frío en productos refrigerados y congelados, con registro diario de temperaturas.</w:t>
+      </w:r>
+    </w:p>
+    <w:p>
+      <w:pPr>
+        <w:spacing w:before="0" w:after="160" w:line="360" w:lineRule="auto"/>
+        <w:jc w:val="both"/>
+        <w:rPr>
+          <w:rFonts w:cs="Arial"/>
+          <w:szCs w:val="24"/>
+          <w:lang w:val="es-SV"/>
+        </w:rPr>
+      </w:pPr>
+      <w:r>
+        <w:rPr>
+          <w:rFonts w:cs="Arial"/>
+          <w:b/>
+          <w:szCs w:val="24"/>
+          <w:lang w:val="es-SV"/>
+        </w:rPr>
+        <w:t xml:space="preserve">Acción 4. </w:t>
+      </w:r>
+      <w:r>
+        <w:rPr>
+          <w:rFonts w:cs="Arial"/>
+          <w:szCs w:val="24"/>
+          <w:lang w:val="es-SV"/>
+        </w:rPr>
+        <w:t xml:space="preserve">Separar los productos de limpieza y químicos de los alimentos, tanto en bodega como en los anaqueles.</w:t>
+      </w:r>
+    </w:p>
+    <w:p>
+      <w:pPr>
+        <w:spacing w:before="0" w:after="160" w:line="360" w:lineRule="auto"/>
+        <w:jc w:val="both"/>
+        <w:rPr>
+          <w:rFonts w:cs="Arial"/>
+          <w:szCs w:val="24"/>
+          <w:lang w:val="es-SV"/>
+        </w:rPr>
+      </w:pPr>
+      <w:r>
+        <w:rPr>
+          <w:rFonts w:cs="Arial"/>
+          <w:b/>
+          <w:szCs w:val="24"/>
+          <w:lang w:val="es-SV"/>
+        </w:rPr>
+        <w:t xml:space="preserve">Acción 5. </w:t>
+      </w:r>
+      <w:r>
+        <w:rPr>
+          <w:rFonts w:cs="Arial"/>
+          <w:szCs w:val="24"/>
+          <w:lang w:val="es-SV"/>
+        </w:rPr>
+        <w:t xml:space="preserve">Aplicar el método “primero en vencer, primero en salir” para evitar la venta de productos vencidos.</w:t>
+      </w:r>
+    </w:p>
+    <w:p>
+      <w:pPr>
+        <w:spacing w:before="240" w:after="160" w:line="360" w:lineRule="auto"/>
+        <w:jc w:val="both"/>
+        <w:rPr>
+          <w:rFonts w:cs="Arial"/>
+          <w:b/>
+          <w:szCs w:val="24"/>
+          <w:lang w:val="es-SV"/>
+        </w:rPr>
+      </w:pPr>
+      <w:r>
+        <w:rPr>
+          <w:rFonts w:cs="Arial"/>
+          <w:b/>
+          <w:szCs w:val="24"/>
+          <w:lang w:val="es-SV"/>
+        </w:rPr>
+        <w:t xml:space="preserve">Etapa 3. Información y advertencias al consumidor</w:t>
+      </w:r>
+    </w:p>
+    <w:p>
+      <w:pPr>
+        <w:spacing w:before="0" w:after="160" w:line="360" w:lineRule="auto"/>
+        <w:jc w:val="both"/>
+        <w:rPr>
+          <w:rFonts w:cs="Arial"/>
+          <w:szCs w:val="24"/>
+          <w:lang w:val="es-SV"/>
+        </w:rPr>
+      </w:pPr>
+      <w:r>
+        <w:rPr>
+          <w:rFonts w:cs="Arial"/>
+          <w:b/>
+          <w:szCs w:val="24"/>
+          <w:lang w:val="es-SV"/>
+        </w:rPr>
+        <w:t xml:space="preserve">Acción 6. </w:t>
+      </w:r>
+      <w:r>
+        <w:rPr>
+          <w:rFonts w:cs="Arial"/>
+          <w:szCs w:val="24"/>
+          <w:lang w:val="es-SV"/>
+        </w:rPr>
+        <w:t xml:space="preserve">Colocar los precios de forma visible y coincidente con el precio cobrado en caja.</w:t>
+      </w:r>
+    </w:p>
+    <w:p>
+      <w:pPr>
+        <w:spacing w:before="0" w:after="160" w:line="360" w:lineRule="auto"/>
+        <w:jc w:val="both"/>
+        <w:rPr>
+          <w:rFonts w:cs="Arial"/>
+          <w:szCs w:val="24"/>
+          <w:lang w:val="es-SV"/>
+        </w:rPr>
+      </w:pPr>
+      <w:r>
+        <w:rPr>
+          <w:rFonts w:cs="Arial"/>
+          <w:b/>
+          <w:szCs w:val="24"/>
+          <w:lang w:val="es-SV"/>
+        </w:rPr>
+        <w:t xml:space="preserve">Acción 7. </w:t>
+      </w:r>
+      <w:r>
+        <w:rPr>
+          <w:rFonts w:cs="Arial"/>
+          <w:szCs w:val="24"/>
+          <w:lang w:val="es-SV"/>
+        </w:rPr>
+        <w:t xml:space="preserve">Señalizar en el anaquel los productos con alérgenos, alto contenido de azúcar, sodio o grasas, y los productos que no son aptos para niños.</w:t>
+      </w:r>
+    </w:p>
+    <w:p>
+      <w:pPr>
+        <w:spacing w:before="0" w:after="160" w:line="360" w:lineRule="auto"/>
+        <w:jc w:val="both"/>
+        <w:rPr>
+          <w:rFonts w:cs="Arial"/>
+          <w:szCs w:val="24"/>
+          <w:lang w:val="es-SV"/>
+        </w:rPr>
+      </w:pPr>
+      <w:r>
+        <w:rPr>
+          <w:rFonts w:cs="Arial"/>
+          <w:b/>
+          <w:szCs w:val="24"/>
+          <w:lang w:val="es-SV"/>
+        </w:rPr>
+        <w:t xml:space="preserve">Acción 8. </w:t>
+      </w:r>
+      <w:r>
+        <w:rPr>
+          <w:rFonts w:cs="Arial"/>
+          <w:szCs w:val="24"/>
+          <w:lang w:val="es-SV"/>
+        </w:rPr>
+        <w:t xml:space="preserve">No ofrecer en promoción productos próximos a vencer sin informarlo de forma clara al consumidor.</w:t>
+      </w:r>
+    </w:p>
+    <w:p>
+      <w:pPr>
+        <w:spacing w:before="240" w:after="160" w:line="360" w:lineRule="auto"/>
+        <w:jc w:val="both"/>
+        <w:rPr>
+          <w:rFonts w:cs="Arial"/>
+          <w:b/>
+          <w:szCs w:val="24"/>
+          <w:lang w:val="es-SV"/>
+        </w:rPr>
+      </w:pPr>
+      <w:r>
+        <w:rPr>
+          <w:rFonts w:cs="Arial"/>
+          <w:b/>
+          <w:szCs w:val="24"/>
+          <w:lang w:val="es-SV"/>
+        </w:rPr>
+        <w:t xml:space="preserve">Etapa 4. Atención a consumidores vulnerables</w:t>
+      </w:r>
+    </w:p>
+    <w:p>
+      <w:pPr>
+        <w:spacing w:before="0" w:after="160" w:line="360" w:lineRule="auto"/>
+        <w:jc w:val="both"/>
+        <w:rPr>
+          <w:rFonts w:cs="Arial"/>
+          <w:szCs w:val="24"/>
+          <w:lang w:val="es-SV"/>
+        </w:rPr>
+      </w:pPr>
+      <w:r>
+        <w:rPr>
+          <w:rFonts w:cs="Arial"/>
+          <w:b/>
+          <w:szCs w:val="24"/>
+          <w:lang w:val="es-SV"/>
+        </w:rPr>
+        <w:t xml:space="preserve">Acción 9. </w:t>
+      </w:r>
+      <w:r>
+        <w:rPr>
+          <w:rFonts w:cs="Arial"/>
+          <w:szCs w:val="24"/>
+          <w:lang w:val="es-SV"/>
+        </w:rPr>
+        <w:t xml:space="preserve">Ubicar los productos peligrosos fuera del alcance de los niños.</w:t>
+      </w:r>
+    </w:p>
+    <w:p>
+      <w:pPr>
+        <w:spacing w:before="0" w:after="160" w:line="360" w:lineRule="auto"/>
+        <w:jc w:val="both"/>
+        <w:rPr>
+          <w:rFonts w:cs="Arial"/>
+          <w:szCs w:val="24"/>
+          <w:lang w:val="es-SV"/>
+        </w:rPr>
+      </w:pPr>
+      <w:r>
+        <w:rPr>
+          <w:rFonts w:cs="Arial"/>
+          <w:b/>
+          <w:szCs w:val="24"/>
+          <w:lang w:val="es-SV"/>
+        </w:rPr>
+        <w:t xml:space="preserve">Acción 10. </w:t>
+      </w:r>
+      <w:r>
+        <w:rPr>
+          <w:rFonts w:cs="Arial"/>
+          <w:szCs w:val="24"/>
+          <w:lang w:val="es-SV"/>
+        </w:rPr>
+        <w:t xml:space="preserve">Brindar asistencia a personas adultas mayores y personas con discapacidad que necesiten información sobre los productos.</w:t>
+      </w:r>
+    </w:p>
+    <w:p>
+      <w:pPr>
+        <w:spacing w:before="240" w:after="160" w:line="360" w:lineRule="auto"/>
+        <w:jc w:val="both"/>
+        <w:rPr>
+          <w:rFonts w:cs="Arial"/>
+          <w:b/>
+          <w:szCs w:val="24"/>
+          <w:lang w:val="es-SV"/>
+        </w:rPr>
+      </w:pPr>
+      <w:r>
+        <w:rPr>
+          <w:rFonts w:cs="Arial"/>
+          <w:b/>
+          <w:szCs w:val="24"/>
+          <w:lang w:val="es-SV"/>
+        </w:rPr>
+        <w:t xml:space="preserve">Etapa 5. Seguimiento después de la venta</w:t>
+      </w:r>
+    </w:p>
+    <w:p>
+      <w:pPr>
+        <w:spacing w:before="0" w:after="160" w:line="360" w:lineRule="auto"/>
+        <w:jc w:val="both"/>
+        <w:rPr>
+          <w:rFonts w:cs="Arial"/>
+          <w:szCs w:val="24"/>
+          <w:lang w:val="es-SV"/>
+        </w:rPr>
+      </w:pPr>
+      <w:r>
+        <w:rPr>
+          <w:rFonts w:cs="Arial"/>
+          <w:b/>
+          <w:szCs w:val="24"/>
+          <w:lang w:val="es-SV"/>
+        </w:rPr>
+        <w:t xml:space="preserve">Acción 11. </w:t>
+      </w:r>
+      <w:r>
+        <w:rPr>
+          <w:rFonts w:cs="Arial"/>
+          <w:szCs w:val="24"/>
+          <w:lang w:val="es-SV"/>
+        </w:rPr>
+        <w:t xml:space="preserve">Contar con un área de atención al cliente que reciba y resuelva reclamos, cambios y devoluciones en un plazo máximo de cinco días hábiles.</w:t>
+      </w:r>
+    </w:p>
+    <w:p>
+      <w:pPr>
+        <w:spacing w:before="0" w:after="160" w:line="360" w:lineRule="auto"/>
+        <w:jc w:val="both"/>
+        <w:rPr>
+          <w:rFonts w:cs="Arial"/>
+          <w:szCs w:val="24"/>
+          <w:lang w:val="es-SV"/>
+        </w:rPr>
+      </w:pPr>
+      <w:r>
+        <w:rPr>
+          <w:rFonts w:cs="Arial"/>
+          <w:b/>
+          <w:szCs w:val="24"/>
+          <w:lang w:val="es-SV"/>
+        </w:rPr>
+        <w:t xml:space="preserve">Acción 12. </w:t>
+      </w:r>
+      <w:r>
+        <w:rPr>
+          <w:rFonts w:cs="Arial"/>
+          <w:szCs w:val="24"/>
+          <w:lang w:val="es-SV"/>
+        </w:rPr>
+        <w:t xml:space="preserve">Retirar de inmediato de los anaqueles cualquier producto que presente defectos, contaminación o alertas sanitarias, e informar a los consumidores que lo hayan comprado.</w:t>
+      </w:r>
+    </w:p>
+    <w:p>
+      <w:pPr>
+        <w:spacing w:before="0" w:after="160" w:line="360" w:lineRule="auto"/>
+        <w:jc w:val="both"/>
+        <w:rPr>
+          <w:rFonts w:cs="Arial"/>
+          <w:szCs w:val="24"/>
+          <w:lang w:val="es-SV"/>
+        </w:rPr>
+      </w:pPr>
+      <w:r>
+        <w:rPr>
+          <w:rFonts w:cs="Arial"/>
+          <w:b/>
+          <w:szCs w:val="24"/>
+          <w:lang w:val="es-SV"/>
+        </w:rPr>
+        <w:t xml:space="preserve">Acción 13. </w:t>
+      </w:r>
+      <w:r>
+        <w:rPr>
+          <w:rFonts w:cs="Arial"/>
+          <w:szCs w:val="24"/>
+          <w:lang w:val="es-SV"/>
+        </w:rPr>
+        <w:t xml:space="preserve">Responder por los daños que un producto en mal estado cause al consumidor.</w:t>
+      </w:r>
+    </w:p>
+    <w:p>
+      <w:pPr>
+        <w:spacing w:before="240" w:after="160" w:line="360" w:lineRule="auto"/>
+        <w:jc w:val="both"/>
+        <w:rPr>
+          <w:rFonts w:cs="Arial"/>
+          <w:b/>
+          <w:szCs w:val="24"/>
+          <w:lang w:val="es-SV"/>
+        </w:rPr>
+      </w:pPr>
+      <w:r>
+        <w:rPr>
+          <w:rFonts w:cs="Arial"/>
+          <w:b/>
+          <w:szCs w:val="24"/>
+          <w:lang w:val="es-SV"/>
+        </w:rPr>
+        <w:t xml:space="preserve">Etapa 6. Respuesta a los problemas de la teoría del debido cuidado</w:t>
+      </w:r>
+    </w:p>
+    <w:p>
+      <w:pPr>
+        <w:spacing w:before="0" w:after="160" w:line="360" w:lineRule="auto"/>
+        <w:jc w:val="both"/>
+        <w:rPr>
+          <w:rFonts w:cs="Arial"/>
+          <w:szCs w:val="24"/>
+          <w:lang w:val="es-SV"/>
+        </w:rPr>
+      </w:pPr>
+      <w:r>
+        <w:rPr>
+          <w:rFonts w:cs="Arial"/>
+          <w:szCs w:val="24"/>
+          <w:lang w:val="es-SV"/>
+        </w:rPr>
+        <w:t xml:space="preserve">Uno de los problemas de esta teoría es que no existe un criterio exacto para saber cuánto cuidado es “suficiente”, ni quién decide qué riesgo es aceptable. Para resolverlo, este protocolo toma como referencia mínima la Ley de Protección al Consumidor de El Salvador, las normas sanitarias del Ministerio de Salud y los reglamentos técnicos de calidad, y propone ir más allá de ellos cuando la seguridad del consumidor lo requiera.</w:t>
+      </w:r>
+    </w:p>
+    <w:p>
+      <w:pPr>
+        <w:spacing w:before="240" w:after="160" w:line="360" w:lineRule="auto"/>
+        <w:jc w:val="both"/>
+        <w:rPr>
+          <w:rFonts w:cs="Arial"/>
+          <w:b/>
+          <w:szCs w:val="24"/>
+          <w:lang w:val="es-SV"/>
+        </w:rPr>
+      </w:pPr>
+      <w:r>
+        <w:rPr>
+          <w:rFonts w:cs="Arial"/>
+          <w:b/>
+          <w:szCs w:val="24"/>
+          <w:lang w:val="es-SV"/>
+        </w:rPr>
+        <w:t xml:space="preserve">Etapa 7. Mecanismos de aplicación y control</w:t>
+      </w:r>
+    </w:p>
+    <w:p>
+      <w:pPr>
+        <w:spacing w:before="0" w:after="160" w:line="360" w:lineRule="auto"/>
+        <w:jc w:val="both"/>
+        <w:rPr>
+          <w:rFonts w:cs="Arial"/>
+          <w:szCs w:val="24"/>
+          <w:lang w:val="es-SV"/>
+        </w:rPr>
+      </w:pPr>
+      <w:r>
+        <w:rPr>
+          <w:rFonts w:cs="Arial"/>
+          <w:b/>
+          <w:szCs w:val="24"/>
+          <w:lang w:val="es-SV"/>
+        </w:rPr>
+        <w:t xml:space="preserve">Acción 14. </w:t>
+      </w:r>
+      <w:r>
+        <w:rPr>
+          <w:rFonts w:cs="Arial"/>
+          <w:szCs w:val="24"/>
+          <w:lang w:val="es-SV"/>
+        </w:rPr>
+        <w:t xml:space="preserve">Designar a un responsable de calidad en cada sucursal que verifique el cumplimiento de este protocolo.</w:t>
+      </w:r>
+    </w:p>
+    <w:p>
+      <w:pPr>
+        <w:spacing w:before="0" w:after="160" w:line="360" w:lineRule="auto"/>
+        <w:jc w:val="both"/>
+        <w:rPr>
+          <w:rFonts w:cs="Arial"/>
+          <w:szCs w:val="24"/>
+          <w:lang w:val="es-SV"/>
+        </w:rPr>
+      </w:pPr>
+      <w:r>
+        <w:rPr>
+          <w:rFonts w:cs="Arial"/>
+          <w:b/>
+          <w:szCs w:val="24"/>
+          <w:lang w:val="es-SV"/>
+        </w:rPr>
+        <w:t xml:space="preserve">Acción 15. </w:t>
+      </w:r>
+      <w:r>
+        <w:rPr>
+          <w:rFonts w:cs="Arial"/>
+          <w:szCs w:val="24"/>
+          <w:lang w:val="es-SV"/>
+        </w:rPr>
+        <w:t xml:space="preserve">Capacitar cada seis meses al personal de bodega, sala de venta y atención al cliente sobre el debido cuidado y los derechos del consumidor.</w:t>
+      </w:r>
+    </w:p>
+    <w:p>
+      <w:pPr>
+        <w:spacing w:before="0" w:after="160" w:line="360" w:lineRule="auto"/>
+        <w:jc w:val="both"/>
+        <w:rPr>
+          <w:rFonts w:cs="Arial"/>
+          <w:szCs w:val="24"/>
+          <w:lang w:val="es-SV"/>
+        </w:rPr>
+      </w:pPr>
+      <w:r>
+        <w:rPr>
+          <w:rFonts w:cs="Arial"/>
+          <w:b/>
+          <w:szCs w:val="24"/>
+          <w:lang w:val="es-SV"/>
+        </w:rPr>
+        <w:t xml:space="preserve">Acción 16. </w:t>
+      </w:r>
+      <w:r>
+        <w:rPr>
+          <w:rFonts w:cs="Arial"/>
+          <w:szCs w:val="24"/>
+          <w:lang w:val="es-SV"/>
+        </w:rPr>
+        <w:t xml:space="preserve">Realizar revisiones mensuales de anaqueles y bodegas, y llevar un registro de los hallazgos y las medidas tomadas.</w:t>
+      </w:r>
+    </w:p>
+    <w:p>
+      <w:pPr>
+        <w:spacing w:before="0" w:after="160" w:line="360" w:lineRule="auto"/>
+        <w:jc w:val="both"/>
+        <w:rPr>
+          <w:rFonts w:cs="Arial"/>
+          <w:szCs w:val="24"/>
+          <w:lang w:val="es-SV"/>
+        </w:rPr>
+      </w:pPr>
+      <w:r>
+        <w:rPr>
+          <w:rFonts w:cs="Arial"/>
+          <w:b/>
+          <w:szCs w:val="24"/>
+          <w:lang w:val="es-SV"/>
+        </w:rPr>
+        <w:t xml:space="preserve">Acción 17. </w:t>
+      </w:r>
+      <w:r>
+        <w:rPr>
+          <w:rFonts w:cs="Arial"/>
+          <w:szCs w:val="24"/>
+          <w:lang w:val="es-SV"/>
+        </w:rPr>
+        <w:t xml:space="preserve">Colaborar con la Defensoría del Consumidor en la solución de reclamos y denuncias.</w:t>
+      </w:r>
+    </w:p>
+    <w:p>
+      <w:pPr>
+        <w:spacing w:before="240" w:after="160" w:line="360" w:lineRule="auto"/>
+        <w:jc w:val="both"/>
+        <w:rPr>
+          <w:rFonts w:cs="Arial"/>
+          <w:b/>
+          <w:szCs w:val="24"/>
+          <w:lang w:val="es-SV"/>
+        </w:rPr>
+      </w:pPr>
+      <w:r>
+        <w:rPr>
+          <w:rFonts w:cs="Arial"/>
+          <w:b/>
+          <w:szCs w:val="24"/>
+          <w:lang w:val="es-SV"/>
+        </w:rPr>
+        <w:t xml:space="preserve">Conclusión</w:t>
+      </w:r>
+    </w:p>
+    <w:p>
+      <w:pPr>
+        <w:spacing w:before="0" w:after="160" w:line="360" w:lineRule="auto"/>
+        <w:jc w:val="both"/>
+        <w:rPr>
+          <w:rFonts w:cs="Arial"/>
+          <w:szCs w:val="24"/>
+          <w:lang w:val="es-SV"/>
+        </w:rPr>
+      </w:pPr>
+      <w:r>
+        <w:rPr>
+          <w:rFonts w:cs="Arial"/>
+          <w:szCs w:val="24"/>
+          <w:lang w:val="es-SV"/>
+        </w:rPr>
+        <w:t xml:space="preserve">Aplicar la teoría del debido cuidado no solo protege la salud y la seguridad del consumidor, sino que también fortalece la confianza en la empresa. Un supermercado que vende productos seguros, informa con claridad y responde ante los problemas actúa de manera ética y gana la lealtad de sus clientes a largo plazo.</w:t>
       </w:r>
     </w:p>
     <w:sectPr>

</xml_diff>